<commit_message>
Make the approach write-up one page, and generate it
It ran to three pages, and the prose was not the reason: the two diagrams are
drawn for 6.5 inches and took most of two pages between them. Measuring the text
on its own at the file's own typography — Calibri 11pt, one-inch margins — it is
one page with room to spare, and the room left beside it is about two inches,
where those diagrams' labels stop being readable. They stay in the README at
full size and the write-up says where they are.

The .docx is now generated from SUBMISSION.md rather than kept beside it, so
there is one document to edit instead of two that drift. A paragraph on where
rules are enforced replaces nothing — it is what the last few commits made true.

Co-Authored-By: Claude Opus 5 <noreply@anthropic.com>
</commit_message>
<xml_diff>
--- a/Approach and key decisions.docx
+++ b/Approach and key decisions.docx
@@ -4,14 +4,13 @@
   <w:body>
     <w:p>
       <w:pPr>
-        <w:spacing w:after="60"/>
-      </w:pPr>
-      <w:r>
-        <w:rPr>
-          <w:rFonts w:ascii="Calibri" w:cs="Calibri" w:eastAsia="Calibri" w:hAnsi="Calibri"/>
+        <w:pStyle w:val="Heading1"/>
+        <w:spacing w:after="200"/>
+      </w:pPr>
+      <w:r>
+        <w:rPr>
           <w:b/>
           <w:bCs/>
-          <w:color w:val="1A1A19"/>
           <w:sz w:val="32"/>
           <w:szCs w:val="32"/>
         </w:rPr>
@@ -20,411 +19,213 @@
     </w:p>
     <w:p>
       <w:pPr>
-        <w:pBdr>
-          <w:bottom w:val="single" w:color="D8D8D5" w:sz="6" w:space="8"/>
-        </w:pBdr>
-        <w:spacing w:after="320"/>
-      </w:pPr>
-      <w:r>
-        <w:rPr>
-          <w:rFonts w:ascii="Calibri" w:cs="Calibri" w:eastAsia="Calibri" w:hAnsi="Calibri"/>
-          <w:color w:val="5A5A57"/>
-          <w:sz w:val="20"/>
-          <w:szCs w:val="20"/>
-        </w:rPr>
-        <w:t xml:space="preserve">Redesign the Tax Workpaper</w:t>
-      </w:r>
-      <w:r>
-        <w:rPr>
-          <w:rFonts w:ascii="Calibri" w:cs="Calibri" w:eastAsia="Calibri" w:hAnsi="Calibri"/>
-          <w:color w:val="C8C8C5"/>
-          <w:sz w:val="20"/>
-          <w:szCs w:val="20"/>
-        </w:rPr>
-        <w:t xml:space="preserve">   ·   </w:t>
-      </w:r>
-      <w:hyperlink w:history="1" r:id="rIdmseaewa4ul6l4vr8dp0vx">
-        <w:r>
-          <w:rPr>
-            <w:rFonts w:ascii="Calibri" w:cs="Calibri" w:eastAsia="Calibri" w:hAnsi="Calibri"/>
-            <w:color w:val="1F5C8B"/>
-            <w:sz w:val="20"/>
-            <w:szCs w:val="20"/>
-            <w:u w:val="single"/>
-          </w:rPr>
-          <w:t xml:space="preserve">Live app</w:t>
-        </w:r>
-      </w:hyperlink>
-      <w:r>
-        <w:rPr>
-          <w:rFonts w:ascii="Calibri" w:cs="Calibri" w:eastAsia="Calibri" w:hAnsi="Calibri"/>
-          <w:color w:val="C8C8C5"/>
-          <w:sz w:val="20"/>
-          <w:szCs w:val="20"/>
-        </w:rPr>
-        <w:t xml:space="preserve">   ·   </w:t>
-      </w:r>
-      <w:hyperlink w:history="1" r:id="rIdlgcvqdtj32ivxfu0kmhsy">
-        <w:r>
-          <w:rPr>
-            <w:rFonts w:ascii="Calibri" w:cs="Calibri" w:eastAsia="Calibri" w:hAnsi="Calibri"/>
-            <w:color w:val="1F5C8B"/>
-            <w:sz w:val="20"/>
-            <w:szCs w:val="20"/>
-            <w:u w:val="single"/>
-          </w:rPr>
-          <w:t xml:space="preserve">Repository</w:t>
-        </w:r>
-      </w:hyperlink>
-    </w:p>
-    <w:p>
-      <w:pPr>
-        <w:spacing w:after="200" w:line="276"/>
-        <w:jc w:val="both"/>
-      </w:pPr>
-      <w:r>
-        <w:rPr>
-          <w:rFonts w:ascii="Calibri" w:cs="Calibri" w:eastAsia="Calibri" w:hAnsi="Calibri"/>
-          <w:color w:val="1A1A19"/>
-          <w:sz w:val="22"/>
-          <w:szCs w:val="22"/>
-        </w:rPr>
-        <w:t xml:space="preserve">A workpaper is not a spreadsheet. It is a </w:t>
-      </w:r>
-      <w:r>
-        <w:rPr>
-          <w:rFonts w:ascii="Calibri" w:cs="Calibri" w:eastAsia="Calibri" w:hAnsi="Calibri"/>
+        <w:spacing w:after="160" w:line="276"/>
+        <w:jc w:val="left"/>
+      </w:pPr>
+      <w:r>
+        <w:rPr>
+          <w:b w:val="false"/>
+          <w:bCs w:val="false"/>
+        </w:rPr>
+        <w:t xml:space="preserve">A workpaper is not a spreadsheet. It is a</w:t>
+      </w:r>
+      <w:r>
+        <w:t xml:space="preserve"> </w:t>
+      </w:r>
+      <w:r>
+        <w:rPr>
           <w:b/>
           <w:bCs/>
-          <w:color w:val="1A1A19"/>
-          <w:sz w:val="22"/>
-          <w:szCs w:val="22"/>
         </w:rPr>
         <w:t xml:space="preserve">ledger</w:t>
       </w:r>
       <w:r>
         <w:rPr>
-          <w:rFonts w:ascii="Calibri" w:cs="Calibri" w:eastAsia="Calibri" w:hAnsi="Calibri"/>
-          <w:color w:val="1A1A19"/>
-          <w:sz w:val="22"/>
-          <w:szCs w:val="22"/>
-        </w:rPr>
-        <w:t xml:space="preserve">: an immutable fact layer (the packet, loaded as delivered), an append-only event layer (everything people do), and views folded from the two. Every number answers two questions — which facts is it made of, and whose actions have touched it. Prove-the-number, sign-offs that reopen, freeze-then-amend, and answering a notice years later are not four features; they are one shape, and a grid has neither half of it.</w:t>
-      </w:r>
-    </w:p>
-    <w:p>
-      <w:pPr>
-        <w:spacing w:after="200" w:line="276"/>
-        <w:jc w:val="both"/>
-      </w:pPr>
-      <w:r>
-        <w:rPr>
-          <w:rFonts w:ascii="Calibri" w:cs="Calibri" w:eastAsia="Calibri" w:hAnsi="Calibri"/>
-          <w:color w:val="1A1A19"/>
-          <w:sz w:val="22"/>
-          <w:szCs w:val="22"/>
-        </w:rPr>
-        <w:t xml:space="preserve">Four decisions did most of the work.</w:t>
-      </w:r>
-    </w:p>
-    <w:p>
-      <w:pPr>
-        <w:spacing w:after="200" w:line="276"/>
-        <w:jc w:val="both"/>
-      </w:pPr>
-      <w:r>
-        <w:rPr>
-          <w:rFonts w:ascii="Calibri" w:cs="Calibri" w:eastAsia="Calibri" w:hAnsi="Calibri"/>
+          <w:b w:val="false"/>
+          <w:bCs w:val="false"/>
+        </w:rPr>
+        <w:t xml:space="preserve">: an immutable fact layer (the packet, loaded as delivered), an append-only event layer (everything people do), and views folded from the two. Every number answers two questions — which facts is it made of, and whose actions have touched it. Prove-the-number, sign-offs that reopen, freeze-then-amend, and answering a notice years later are not four features; they are one shape.</w:t>
+      </w:r>
+    </w:p>
+    <w:p>
+      <w:pPr>
+        <w:spacing w:after="160" w:line="276"/>
+        <w:jc w:val="left"/>
+      </w:pPr>
+      <w:r>
+        <w:rPr>
           <w:b/>
           <w:bCs/>
-          <w:color w:val="1A1A19"/>
-          <w:sz w:val="22"/>
-          <w:szCs w:val="22"/>
         </w:rPr>
         <w:t xml:space="preserve">One reference grammar, one resolver.</w:t>
       </w:r>
       <w:r>
-        <w:rPr>
-          <w:rFonts w:ascii="Calibri" w:cs="Calibri" w:eastAsia="Calibri" w:hAnsi="Calibri"/>
-          <w:color w:val="1A1A19"/>
-          <w:sz w:val="22"/>
-          <w:szCs w:val="22"/>
-        </w:rPr>
-        <w:t xml:space="preserve"> The packet addresses everything by short strings in eleven formats. A single parser and one resolver mean every click-through in the app is the same operation. All 8,691 references parse; all 2,749 reference sites in the current return resolve. When client answers needed to become evidence, they got a reference in the same grammar and nothing else changed.</w:t>
-      </w:r>
-    </w:p>
-    <w:p>
-      <w:pPr>
-        <w:spacing w:after="60" w:before="120"/>
-        <w:jc w:val="center"/>
-      </w:pPr>
-      <w:r>
-        <w:drawing>
-          <wp:inline distT="0" distB="0" distL="0" distR="0">
-            <wp:extent cx="5943600" cy="4038600"/>
-            <wp:effectExtent t="0" r="0" b="0" l="0"/>
-            <wp:docPr id="1" name="" descr="" title=""/>
-            <wp:cNvGraphicFramePr>
-              <a:graphicFrameLocks xmlns:a="http://schemas.openxmlformats.org/drawingml/2006/main" noChangeAspect="1"/>
-            </wp:cNvGraphicFramePr>
-            <a:graphic xmlns:a="http://schemas.openxmlformats.org/drawingml/2006/main">
-              <a:graphicData uri="http://schemas.openxmlformats.org/drawingml/2006/picture">
-                <pic:pic xmlns:pic="http://schemas.openxmlformats.org/drawingml/2006/picture">
-                  <pic:nvPicPr>
-                    <pic:cNvPr id="0" name="" descr=""/>
-                    <pic:cNvPicPr>
-                      <a:picLocks noChangeAspect="1" noChangeArrowheads="1"/>
-                    </pic:cNvPicPr>
-                  </pic:nvPicPr>
-                  <pic:blipFill>
-                    <a:blip r:embed="rId9" cstate="none"/>
-                    <a:srcRect/>
-                    <a:stretch>
-                      <a:fillRect/>
-                    </a:stretch>
-                  </pic:blipFill>
-                  <pic:spPr bwMode="auto">
-                    <a:xfrm>
-                      <a:off x="0" y="0"/>
-                      <a:ext cx="5943600" cy="4038600"/>
-                    </a:xfrm>
-                    <a:prstGeom prst="rect">
-                      <a:avLst/>
-                    </a:prstGeom>
-                  </pic:spPr>
-                </pic:pic>
-              </a:graphicData>
-            </a:graphic>
-          </wp:inline>
-        </w:drawing>
-      </w:r>
-    </w:p>
-    <w:p>
-      <w:pPr>
-        <w:spacing w:after="260"/>
-        <w:jc w:val="center"/>
-      </w:pPr>
-      <w:r>
-        <w:rPr>
-          <w:rFonts w:ascii="Calibri" w:cs="Calibri" w:eastAsia="Calibri" w:hAnsi="Calibri"/>
-          <w:i/>
-          <w:iCs/>
-          <w:color w:val="5A5A57"/>
-          <w:sz w:val="17"/>
-          <w:szCs w:val="17"/>
-        </w:rPr>
-        <w:t xml:space="preserve">Every number reaches its evidence two ways, and one resolver opens both.</w:t>
-      </w:r>
-    </w:p>
-    <w:p>
-      <w:pPr>
-        <w:spacing w:after="200" w:line="276"/>
-        <w:jc w:val="both"/>
-      </w:pPr>
-      <w:r>
-        <w:rPr>
-          <w:rFonts w:ascii="Calibri" w:cs="Calibri" w:eastAsia="Calibri" w:hAnsi="Calibri"/>
+        <w:t xml:space="preserve"> </w:t>
+      </w:r>
+      <w:r>
+        <w:rPr>
+          <w:b w:val="false"/>
+          <w:bCs w:val="false"/>
+        </w:rPr>
+        <w:t xml:space="preserve">The packet addresses everything by short strings in eleven formats. A single parser makes every click-through the same operation: all 8,691 references parse, all 2,749 reference sites in the current return resolve. When client answers had to become evidence, they got a reference in the same grammar and nothing else changed.</w:t>
+      </w:r>
+    </w:p>
+    <w:p>
+      <w:pPr>
+        <w:spacing w:after="160" w:line="276"/>
+        <w:jc w:val="left"/>
+      </w:pPr>
+      <w:r>
+        <w:rPr>
           <w:b/>
           <w:bCs/>
-          <w:color w:val="1A1A19"/>
-          <w:sz w:val="22"/>
-          <w:szCs w:val="22"/>
         </w:rPr>
         <w:t xml:space="preserve">Append-only, enforced by the database.</w:t>
       </w:r>
       <w:r>
-        <w:rPr>
-          <w:rFonts w:ascii="Calibri" w:cs="Calibri" w:eastAsia="Calibri" w:hAnsi="Calibri"/>
-          <w:color w:val="1A1A19"/>
-          <w:sz w:val="22"/>
-          <w:szCs w:val="22"/>
-        </w:rPr>
-        <w:t xml:space="preserve"> Triggers abort UPDATE and DELETE, so undo is a compensating event and the withdrawn entry stays on the record. That one decision covers keeping the original, showing what changed, bulk undo, and freeze-then-amend.</w:t>
-      </w:r>
-    </w:p>
-    <w:p>
-      <w:pPr>
-        <w:spacing w:after="200" w:line="276"/>
-        <w:jc w:val="both"/>
-      </w:pPr>
-      <w:r>
-        <w:rPr>
-          <w:rFonts w:ascii="Calibri" w:cs="Calibri" w:eastAsia="Calibri" w:hAnsi="Calibri"/>
+        <w:t xml:space="preserve"> </w:t>
+      </w:r>
+      <w:r>
+        <w:rPr>
+          <w:b w:val="false"/>
+          <w:bCs w:val="false"/>
+        </w:rPr>
+        <w:t xml:space="preserve">Triggers abort UPDATE and DELETE, so undo is a compensating event and the withdrawn entry stays on the record — one decision covering keep-the-original, show-what-changed, bulk undo and freeze-then-amend.</w:t>
+      </w:r>
+    </w:p>
+    <w:p>
+      <w:pPr>
+        <w:spacing w:after="160" w:line="276"/>
+        <w:jc w:val="left"/>
+      </w:pPr>
+      <w:r>
+        <w:rPr>
           <w:b/>
           <w:bCs/>
-          <w:color w:val="1A1A19"/>
-          <w:sz w:val="22"/>
-          <w:szCs w:val="22"/>
         </w:rPr>
         <w:t xml:space="preserve">A sign-off stores a hash of what it covered</w:t>
       </w:r>
       <w:r>
-        <w:rPr>
-          <w:rFonts w:ascii="Calibri" w:cs="Calibri" w:eastAsia="Calibri" w:hAnsi="Calibri"/>
-          <w:color w:val="1A1A19"/>
-          <w:sz w:val="22"/>
-          <w:szCs w:val="22"/>
-        </w:rPr>
-        <w:t xml:space="preserve"> — the line, its inputs traced all the way down, the values underneath, and the work standing at the time. Nothing has to be told a change happened; a change nobody anticipated still reopens it.</w:t>
-      </w:r>
-    </w:p>
-    <w:p>
-      <w:pPr>
-        <w:spacing w:after="200" w:line="276"/>
-        <w:jc w:val="both"/>
-      </w:pPr>
-      <w:r>
-        <w:rPr>
-          <w:rFonts w:ascii="Calibri" w:cs="Calibri" w:eastAsia="Calibri" w:hAnsi="Calibri"/>
+        <w:t xml:space="preserve"> </w:t>
+      </w:r>
+      <w:r>
+        <w:rPr>
+          <w:b w:val="false"/>
+          <w:bCs w:val="false"/>
+        </w:rPr>
+        <w:t xml:space="preserve">— the line, its inputs traced all the way down, the values underneath, and the work standing at the time. Nothing has to be told a change happened; a change nobody anticipated still reopens it.</w:t>
+      </w:r>
+    </w:p>
+    <w:p>
+      <w:pPr>
+        <w:spacing w:after="160" w:line="276"/>
+        <w:jc w:val="left"/>
+      </w:pPr>
+      <w:r>
+        <w:rPr>
           <w:b/>
           <w:bCs/>
-          <w:color w:val="1A1A19"/>
-          <w:sz w:val="22"/>
-          <w:szCs w:val="22"/>
         </w:rPr>
         <w:t xml:space="preserve">The engine cannot be rerun, so every number says which of four things it is:</w:t>
       </w:r>
       <w:r>
-        <w:rPr>
-          <w:rFonts w:ascii="Calibri" w:cs="Calibri" w:eastAsia="Calibri" w:hAnsi="Calibri"/>
-          <w:color w:val="1A1A19"/>
-          <w:sz w:val="22"/>
-          <w:szCs w:val="22"/>
-        </w:rPr>
-        <w:t xml:space="preserve"> engine, manual, recomputed, estimated. The recomputation is not assumed — for each line that is arithmetic over others, the combination reproducing the engine's own published value is solved for and verified: 128 lines, all exact, 19 of them subtracting. Five resist, and propagation </w:t>
-      </w:r>
-      <w:r>
-        <w:rPr>
-          <w:rFonts w:ascii="Calibri" w:cs="Calibri" w:eastAsia="Calibri" w:hAnsi="Calibri"/>
+        <w:t xml:space="preserve"> </w:t>
+      </w:r>
+      <w:r>
+        <w:rPr>
+          <w:b w:val="false"/>
+          <w:bCs w:val="false"/>
+        </w:rPr>
+        <w:t xml:space="preserve">engine, manual, recomputed, estimated. The recomputation is not assumed — for each line that is arithmetic over others, the combination reproducing the engine's own published value is solved for and verified: 128 lines, all exact, 19 of them subtracting. Five resist, and propagation</w:t>
+      </w:r>
+      <w:r>
+        <w:t xml:space="preserve"> </w:t>
+      </w:r>
+      <w:r>
+        <w:rPr>
           <w:b/>
           <w:bCs/>
-          <w:color w:val="1A1A19"/>
-          <w:sz w:val="22"/>
-          <w:szCs w:val="22"/>
         </w:rPr>
         <w:t xml:space="preserve">stops</w:t>
       </w:r>
       <w:r>
-        <w:rPr>
-          <w:rFonts w:ascii="Calibri" w:cs="Calibri" w:eastAsia="Calibri" w:hAnsi="Calibri"/>
-          <w:color w:val="1A1A19"/>
-          <w:sz w:val="22"/>
-          <w:szCs w:val="22"/>
-        </w:rPr>
-        <w:t xml:space="preserve"> there, because beyond them the figures are unknown rather than approximately known.</w:t>
-      </w:r>
-    </w:p>
-    <w:p>
-      <w:pPr>
-        <w:spacing w:after="60" w:before="120"/>
-        <w:jc w:val="center"/>
-      </w:pPr>
-      <w:r>
-        <w:drawing>
-          <wp:inline distT="0" distB="0" distL="0" distR="0">
-            <wp:extent cx="5943600" cy="3990975"/>
-            <wp:effectExtent t="0" r="0" b="0" l="0"/>
-            <wp:docPr id="2" name="" descr="" title=""/>
-            <wp:cNvGraphicFramePr>
-              <a:graphicFrameLocks xmlns:a="http://schemas.openxmlformats.org/drawingml/2006/main" noChangeAspect="1"/>
-            </wp:cNvGraphicFramePr>
-            <a:graphic xmlns:a="http://schemas.openxmlformats.org/drawingml/2006/main">
-              <a:graphicData uri="http://schemas.openxmlformats.org/drawingml/2006/picture">
-                <pic:pic xmlns:pic="http://schemas.openxmlformats.org/drawingml/2006/picture">
-                  <pic:nvPicPr>
-                    <pic:cNvPr id="0" name="" descr=""/>
-                    <pic:cNvPicPr>
-                      <a:picLocks noChangeAspect="1" noChangeArrowheads="1"/>
-                    </pic:cNvPicPr>
-                  </pic:nvPicPr>
-                  <pic:blipFill>
-                    <a:blip r:embed="rId10" cstate="none"/>
-                    <a:srcRect/>
-                    <a:stretch>
-                      <a:fillRect/>
-                    </a:stretch>
-                  </pic:blipFill>
-                  <pic:spPr bwMode="auto">
-                    <a:xfrm>
-                      <a:off x="0" y="0"/>
-                      <a:ext cx="5943600" cy="3990975"/>
-                    </a:xfrm>
-                    <a:prstGeom prst="rect">
-                      <a:avLst/>
-                    </a:prstGeom>
-                  </pic:spPr>
-                </pic:pic>
-              </a:graphicData>
-            </a:graphic>
-          </wp:inline>
-        </w:drawing>
-      </w:r>
-    </w:p>
-    <w:p>
-      <w:pPr>
-        <w:spacing w:after="260"/>
-        <w:jc w:val="center"/>
-      </w:pPr>
-      <w:r>
-        <w:rPr>
-          <w:rFonts w:ascii="Calibri" w:cs="Calibri" w:eastAsia="Calibri" w:hAnsi="Calibri"/>
-          <w:i/>
-          <w:iCs/>
-          <w:color w:val="5A5A57"/>
-          <w:sz w:val="17"/>
-          <w:szCs w:val="17"/>
-        </w:rPr>
-        <w:t xml:space="preserve">An adjustment is carried as far as recovered arithmetic allows, and no further.</w:t>
-      </w:r>
-    </w:p>
-    <w:p>
-      <w:pPr>
-        <w:spacing w:after="200" w:line="276"/>
-        <w:jc w:val="both"/>
-      </w:pPr>
-      <w:r>
-        <w:rPr>
-          <w:rFonts w:ascii="Calibri" w:cs="Calibri" w:eastAsia="Calibri" w:hAnsi="Calibri"/>
-          <w:color w:val="1A1A19"/>
-          <w:sz w:val="22"/>
-          <w:szCs w:val="22"/>
-        </w:rPr>
-        <w:t xml:space="preserve">What it refuses to do is as deliberate. It does not map Form 540 to Form 540NR after a mid-year move, does not subtract across Schedule B lines that name different payers in each year, and does not total findings that are not the same kind of number.</w:t>
-      </w:r>
-    </w:p>
-    <w:p>
-      <w:pPr>
-        <w:spacing w:after="0" w:line="276"/>
-        <w:jc w:val="both"/>
-      </w:pPr>
-      <w:r>
-        <w:rPr>
-          <w:rFonts w:ascii="Calibri" w:cs="Calibri" w:eastAsia="Calibri" w:hAnsi="Calibri"/>
-          <w:color w:val="1A1A19"/>
-          <w:sz w:val="22"/>
-          <w:szCs w:val="22"/>
-        </w:rPr>
-        <w:t xml:space="preserve">Nineteen checks found 112 issues; ten are written up, </w:t>
-      </w:r>
-      <w:r>
-        <w:rPr>
-          <w:rFonts w:ascii="Calibri" w:cs="Calibri" w:eastAsia="Calibri" w:hAnsi="Calibri"/>
+        <w:t xml:space="preserve"> </w:t>
+      </w:r>
+      <w:r>
+        <w:rPr>
+          <w:b w:val="false"/>
+          <w:bCs w:val="false"/>
+        </w:rPr>
+        <w:t xml:space="preserve">there, because beyond them the figures are unknown rather than approximately known.</w:t>
+      </w:r>
+    </w:p>
+    <w:p>
+      <w:pPr>
+        <w:spacing w:after="160" w:line="276"/>
+        <w:jc w:val="left"/>
+      </w:pPr>
+      <w:r>
+        <w:rPr>
+          <w:b w:val="false"/>
+          <w:bCs w:val="false"/>
+        </w:rPr>
+        <w:t xml:space="preserve">A rule lives where its state lives, so every path asks the same one, and seventeen tests assert the refusals: filing while a blocking note stands, adjusting a filed return, withdrawing an entry that is not yours.</w:t>
+      </w:r>
+    </w:p>
+    <w:p>
+      <w:pPr>
+        <w:spacing w:after="160" w:line="276"/>
+        <w:jc w:val="left"/>
+      </w:pPr>
+      <w:r>
+        <w:rPr>
+          <w:b w:val="false"/>
+          <w:bCs w:val="false"/>
+        </w:rPr>
+        <w:t xml:space="preserve">What it refuses to do is as deliberate: no mapping of Form 540 onto Form 540NR after a mid-year move, and no totalling of findings that are not the same kind of number.</w:t>
+      </w:r>
+    </w:p>
+    <w:p>
+      <w:pPr>
+        <w:spacing w:after="160" w:line="276"/>
+        <w:jc w:val="left"/>
+      </w:pPr>
+      <w:r>
+        <w:rPr>
+          <w:b w:val="false"/>
+          <w:bCs w:val="false"/>
+        </w:rPr>
+        <w:t xml:space="preserve">Nineteen checks found 112 issues; ten are written up,</w:t>
+      </w:r>
+      <w:r>
+        <w:t xml:space="preserve"> </w:t>
+      </w:r>
+      <w:r>
+        <w:rPr>
           <w:b/>
           <w:bCs/>
-          <w:color w:val="1A1A19"/>
-          <w:sz w:val="22"/>
-          <w:szCs w:val="22"/>
         </w:rPr>
         <w:t xml:space="preserve">none of them reported by the engine's own diagnostics</w:t>
       </w:r>
       <w:r>
         <w:rPr>
-          <w:rFonts w:ascii="Calibri" w:cs="Calibri" w:eastAsia="Calibri" w:hAnsi="Calibri"/>
-          <w:color w:val="1A1A19"/>
-          <w:sz w:val="22"/>
-          <w:szCs w:val="22"/>
-        </w:rPr>
-        <w:t xml:space="preserve">, and both items the IRS examines in the 2028 letter have findings. The largest: Schedule C gross receipts carry the whole Form 1099-K on top of books revenue that already contains it — 12,400 overstated, about 4,402 of federal tax. The books record proving it had been in the file, read, and cited by nothing.</w:t>
+          <w:b w:val="false"/>
+          <w:bCs w:val="false"/>
+        </w:rPr>
+        <w:t xml:space="preserve">, and both items the IRS examines in the 2028 letter carry findings. The largest: Schedule C gross receipts carry the whole Form 1099-K on top of books revenue that already contains it — 12,400 overstated, about 4,402 of federal tax. The books record proving it had been in the file, read, and cited by nothing.</w:t>
+      </w:r>
+    </w:p>
+    <w:p>
+      <w:pPr>
+        <w:spacing w:after="160" w:line="276"/>
+        <w:jc w:val="left"/>
+      </w:pPr>
+      <w:r>
+        <w:rPr>
+          <w:b w:val="false"/>
+          <w:bCs w:val="false"/>
+        </w:rPr>
+        <w:t xml:space="preserve">The two diagrams of this shape, the ten write-ups, and the running application are in the repository.</w:t>
       </w:r>
     </w:p>
     <w:sectPr>
@@ -612,7 +413,6 @@
     <w:rPrDefault>
       <w:rPr>
         <w:rFonts w:ascii="Calibri" w:cs="Calibri" w:eastAsia="Calibri" w:hAnsi="Calibri"/>
-        <w:color w:val="1A1A19"/>
         <w:sz w:val="22"/>
         <w:szCs w:val="22"/>
       </w:rPr>

</xml_diff>